<commit_message>
final changes in small small bugs and added the market analysis
</commit_message>
<xml_diff>
--- a/agent_server/proposal_techcorp.docx
+++ b/agent_server/proposal_techcorp.docx
@@ -59,7 +59,7 @@
           <w:sz w:val="28"/>
           <w:szCs w:val="28"/>
         </w:rPr>
-        <w:t xml:space="preserve">Matrix Comsec</w:t>
+        <w:t xml:space="preserve">adani</w:t>
       </w:r>
     </w:p>
     <w:p>
@@ -73,7 +73,7 @@
           <w:sz w:val="20"/>
           <w:szCs w:val="20"/>
         </w:rPr>
-        <w:t xml:space="preserve">April 30, 2026</w:t>
+        <w:t xml:space="preserve">May 1, 2026</w:t>
       </w:r>
     </w:p>
     <w:p>
@@ -94,7 +94,7 @@
         <w:spacing w:after="240"/>
       </w:pPr>
       <w:r>
-        <w:t xml:space="preserve">This proposal outlines a comprehensive access control and surveillance solution for Matrix Comsec, designed to meet the specific requirements of a manufacturing facility. Leveraging the COSEC CENTRA Platform, we offer a robust, scalable, and secure solution that enhances operational efficiency, protects valuable assets, and ensures compliance. Our recommended products – COSEC CENTRA PLATFORM (10 units), COSEC CENTRA ACM10 (10 units), COSEC CENTRA PLATFORM (10 units), COSEC ATOM RD100E (10 units), COSEC ATOM RD300SFE (10 units), and COSEC VYOM TAM UD10K (10 units) – address critical security concerns, streamline administration, and provide a reliable foundation for long-term success.  The investment represents a strategic move to protect assets, improve operational control, and solidify Matrix Comsec’s position within the manufacturing sector.</w:t>
+        <w:t xml:space="preserve">This proposal outlines a strategic investment in advanced access control solutions from Adani, specifically focusing on COSEC products designed to enhance security and operational efficiency within manufacturing facilities.  The proposed solution leverages the robust and versatile capabilities of COSEC’s ATOM RD100E readers, offering a comprehensive approach to visitor management, data room security, and IT room control.  This investment directly addresses stringent access requirements, improves operational safety, and provides a scalable, reliable, and secure access control system for a modern manufacturing environment.  We anticipate a significant return on investment through reduced risk, streamlined workflows, and enhanced data protection.</w:t>
       </w:r>
     </w:p>
     <w:p>
@@ -110,15 +110,17 @@
         <w:spacing w:after="240"/>
       </w:pPr>
       <w:r>
-        <w:t xml:space="preserve">Matrix Comsec is a manufacturing facility requiring a robust and adaptable access control and surveillance system. Key needs include:
-*   **Comprehensive Security:** Protecting valuable equipment, materials, and intellectual property from unauthorized access.
-*   **Real-time Monitoring:**  Tracking personnel and assets within the facility for security and operational efficiency.
-*   **Scalability:**  The system must be able to accommodate future expansion and increased security requirements.
-*   **Compliance:** Adherence to industry regulations and internal policies regarding access control.
-*   **Integration:** Seamless integration with existing card reader infrastructure and potentially other security systems.
-*   **Remote Management:**  The ability to remotely monitor and manage the system from a central location.
-*   **Audit Trails:**  Detailed records of all access events for compliance and investigation.
-*   **Cost-Effectiveness:**  A solution that balances security features with a reasonable total cost of ownership.</w:t>
+        <w:t xml:space="preserve">Manufacturing facilities face increasing demands for robust security protocols to protect sensitive data, control access to critical areas, and ensure employee safety. Current access control methods often lack the flexibility and scalability needed to accommodate evolving operational needs.  Key needs include:
+*   **Stringent Access Control:**  Maintaining strict control over who can enter specific areas, particularly data rooms and IT rooms.
+*   **Biometric Authentication:**  Implementing multi-factor authentication (fingerprint, EM card, BLE) for enhanced security.
+*   **Visitor Management:**  Streamlining visitor entry and exit processes, minimizing potential security risks.
+*   **Scalability:**  The ability to easily expand access control capabilities as the facility grows.
+*   **Reliability:**  A system that can withstand demanding operational environments and minimize downtime.
+*   **Integration:** Seamless integration with existing ANPR and boom barrier systems.
+*   **Data Room Security:** Protecting sensitive data within the data room.
+*   **IT Room Control:** Secure access to IT resources.
+*   **Cost-Effectiveness:** Balancing security with budgetary constraints.
+Adani’s COSEC products are specifically engineered to address these needs, offering a superior combination of features, performance, and reliability.</w:t>
       </w:r>
     </w:p>
     <w:p>
@@ -134,14 +136,21 @@
         <w:spacing w:after="240"/>
       </w:pPr>
       <w:r>
-        <w:t xml:space="preserve">We propose a centralized solution utilizing the COSEC CENTRA Platform as the core of the system. This platform will provide:
-*   **COSEC CENTRA PLATFORM (10 Units):**  The central hub for managing all access control, surveillance, and time tracking devices.  It will integrate with existing card readers and provide a unified interface for administration.
-*   **COSEC CENTRA ACM10 (10 Units):**  Critical for network security, providing biometric authentication for enhanced access control.
-*   **COSEC CENTRA PLATFORM (10 Units):**  Centralized management of all devices, simplifying administration and ensuring consistent policy enforcement.
-*   **COSEC ATOM RD100E (10 Units):**  Versatile reader for deployment across the facility, supporting EM Prox Card, BLE, and Wiegand compatibility for future expansion.
-*   **COSEC ATOM RD300SFE (10 Units):**  High-security reader for sensitive areas, offering fingerprint, EM card, and PIN authentication.
-*   **COSEC VYOM TAM UD10K (10 Units):**  Cloud-based access management solution for simplified deployment and management, integrating with existing IT infrastructure.
-This approach ensures a streamlined, secure, and scalable solution tailored to Matrix Comsec’s specific operational needs.</w:t>
+        <w:t xml:space="preserve">We recommend a phased implementation of COSEC products, prioritizing the following:
+*   **COSEC ATOM RD100E (12):**  For data rooms and IT rooms, providing robust biometric authentication and IP65 rating for reliable operation.
+*   **COSEC PATH DCFE (10):**  For smaller departments or areas requiring a more comprehensive system, offering a cost-effective single-door solution with PIN fallback.
+*   **COSEC ARGO FACEE (12):**  For visitor access control, leveraging EM card and BLE authentication for a secure and convenient entry point.
+*   **COSEC ATOM RD100E (10):**  For wider facility deployment, offering a versatile solution for various applications.
+*   **COSEC ARC DC200P (10):**  For multi-building environments, providing flexibility and adaptability to different layouts.
+This solution leverages Adani’s commitment to innovation and provides a tailored approach to meet the specific requirements of each facility.
+**Technical Specifications:**
+*   COSEC ATOM RD100E: Dual-factor authentication (fingerprint, EM card, BLE), IP65 rating, QR e-pass functionality.
+*   COSEC PATH DCFE: Single-door controller, keypad-based PIN fallback, ANPR and boom barrier integration.
+*   COSEC ARGO FACEE: Face recognition, EM card and BLE authentication, IP65 rating.
+*   COSEC ARC DC200P: Compact design, multi-door management, IP65 rating, keypad-based PIN fallback.
+*   COSEC ATOM RD100E: Dual-factor authentication, IP65 rating, QR e-pass functionality.
+  **Total Investment:** $677,520.00
+  **Expected Benefits:** Reduced risk of data breaches, streamlined visitor management, improved operational efficiency, enhanced data protection, and a scalable access control solution.</w:t>
       </w:r>
     </w:p>
     <w:p>
@@ -157,14 +166,7 @@
         <w:spacing w:after="240"/>
       </w:pPr>
       <w:r>
-        <w:t xml:space="preserve">Based on the requirements outlined, we recommend the following products:
-*   **COSEC CENTRA PLATFORM:**  The cornerstone of the system, providing centralized management and integration capabilities.
-*   **COSEC CENTRA ACM10:**  Essential for securing the network and implementing biometric authentication.
-*   **COSEC CENTRA PLATFORM:**  Streamlines administration and ensures consistent policy enforcement.
-*   **COSEC ATOM RD100E:**  Provides robust access control and time tracking capabilities.
-*   **COSEC ATOM RD300SFE:**  Offers high-security access control for sensitive areas.
-*   **COSEC VYOM TAM UD10K:**  Simplifies deployment and management, leveraging cloud technology.
-These products are carefully selected to complement each other and provide a comprehensive security solution.</w:t>
+        <w:t xml:space="preserve">We strongly recommend the COSEC ATOM RD100E readers as the primary solution for this project. Their robust design, dual-factor authentication capabilities, and IP65 rating make them ideal for a manufacturing facility with stringent access control requirements.  The COSEC PATH DCFE offers a cost-effective alternative for smaller departments, while the COSEC ARGO FACEE provides a secure and convenient visitor access solution.  The COSEC ARC DC200P is a valuable addition for multi-building environments, and the COSEC ATOM RD100E provides a versatile solution for a wide range of applications.  Adani’s commitment to quality and reliability ensures a long-term investment in a secure and efficient access control system.</w:t>
       </w:r>
     </w:p>
     <w:tbl>
@@ -319,7 +321,7 @@
           </w:tcPr>
           <w:p>
             <w:r>
-              <w:t xml:space="preserve">COSEC CENTRA PLATFORM</w:t>
+              <w:t xml:space="preserve">COSEC ATOM RD100E</w:t>
             </w:r>
           </w:p>
         </w:tc>
@@ -345,7 +347,7 @@
               <w:jc w:val="center"/>
             </w:pPr>
             <w:r>
-              <w:t xml:space="preserve">10</w:t>
+              <w:t xml:space="preserve">12</w:t>
             </w:r>
           </w:p>
         </w:tc>
@@ -371,7 +373,7 @@
               <w:jc w:val="right"/>
             </w:pPr>
             <w:r>
-              <w:t xml:space="preserve">$500.00</w:t>
+              <w:t xml:space="preserve">$3,800.00</w:t>
             </w:r>
           </w:p>
         </w:tc>
@@ -397,7 +399,7 @@
               <w:jc w:val="right"/>
             </w:pPr>
             <w:r>
-              <w:t xml:space="preserve">$5,000.00</w:t>
+              <w:t xml:space="preserve">$45,600.00</w:t>
             </w:r>
           </w:p>
         </w:tc>
@@ -422,7 +424,7 @@
           </w:tcPr>
           <w:p>
             <w:r>
-              <w:t xml:space="preserve">COSEC CENTRA ACM10</w:t>
+              <w:t xml:space="preserve">COSEC PATH DCFE</w:t>
             </w:r>
           </w:p>
         </w:tc>
@@ -474,7 +476,7 @@
               <w:jc w:val="right"/>
             </w:pPr>
             <w:r>
-              <w:t xml:space="preserve">$170.00</w:t>
+              <w:t xml:space="preserve">$12,500.00</w:t>
             </w:r>
           </w:p>
         </w:tc>
@@ -500,7 +502,7 @@
               <w:jc w:val="right"/>
             </w:pPr>
             <w:r>
-              <w:t xml:space="preserve">$1,700.00</w:t>
+              <w:t xml:space="preserve">$125,000.00</w:t>
             </w:r>
           </w:p>
         </w:tc>
@@ -525,7 +527,7 @@
           </w:tcPr>
           <w:p>
             <w:r>
-              <w:t xml:space="preserve">COSEC CENTRA PLATFORM</w:t>
+              <w:t xml:space="preserve">COSEC ARGO FACEE</w:t>
             </w:r>
           </w:p>
         </w:tc>
@@ -551,7 +553,7 @@
               <w:jc w:val="center"/>
             </w:pPr>
             <w:r>
-              <w:t xml:space="preserve">10</w:t>
+              <w:t xml:space="preserve">12</w:t>
             </w:r>
           </w:p>
         </w:tc>
@@ -577,7 +579,7 @@
               <w:jc w:val="right"/>
             </w:pPr>
             <w:r>
-              <w:t xml:space="preserve">$500.00</w:t>
+              <w:t xml:space="preserve">$19,000.00</w:t>
             </w:r>
           </w:p>
         </w:tc>
@@ -603,7 +605,7 @@
               <w:jc w:val="right"/>
             </w:pPr>
             <w:r>
-              <w:t xml:space="preserve">$5,000.00</w:t>
+              <w:t xml:space="preserve">$228,000.00</w:t>
             </w:r>
           </w:p>
         </w:tc>
@@ -731,7 +733,7 @@
           </w:tcPr>
           <w:p>
             <w:r>
-              <w:t xml:space="preserve">COSEC ATOM RD300SFE</w:t>
+              <w:t xml:space="preserve">COSEC ARC DC200P</w:t>
             </w:r>
           </w:p>
         </w:tc>
@@ -783,7 +785,7 @@
               <w:jc w:val="right"/>
             </w:pPr>
             <w:r>
-              <w:t xml:space="preserve">$11,000.00</w:t>
+              <w:t xml:space="preserve">$9,000.00</w:t>
             </w:r>
           </w:p>
         </w:tc>
@@ -809,7 +811,7 @@
               <w:jc w:val="right"/>
             </w:pPr>
             <w:r>
-              <w:t xml:space="preserve">$110,000.00</w:t>
+              <w:t xml:space="preserve">$90,000.00</w:t>
             </w:r>
           </w:p>
         </w:tc>
@@ -834,7 +836,7 @@
           </w:tcPr>
           <w:p>
             <w:r>
-              <w:t xml:space="preserve">COSEC VYOM TAM UD10K</w:t>
+              <w:t xml:space="preserve">COSEC ATOM RD100E</w:t>
             </w:r>
           </w:p>
         </w:tc>
@@ -886,7 +888,7 @@
               <w:jc w:val="right"/>
             </w:pPr>
             <w:r>
-              <w:t xml:space="preserve">$800.00</w:t>
+              <w:t xml:space="preserve">$3,800.00</w:t>
             </w:r>
           </w:p>
         </w:tc>
@@ -912,7 +914,7 @@
               <w:jc w:val="right"/>
             </w:pPr>
             <w:r>
-              <w:t xml:space="preserve">$8,000.00</w:t>
+              <w:t xml:space="preserve">$38,000.00</w:t>
             </w:r>
           </w:p>
         </w:tc>
@@ -936,14 +938,17 @@
         <w:spacing w:after="240"/>
       </w:pPr>
       <w:r>
-        <w:t xml:space="preserve">The implementation will be phased to minimize disruption:
-1.  **Assessment &amp; Planning (2 weeks):** Detailed site survey, system configuration, and integration planning.
-2.  **Hardware Installation (4 weeks):** COSEC CENTRA Platform installation, COSEC CENTRA ACM10, COSEC ATOM RD100E, COSEC ATOM RD300SFE, and COSEC VYOM TAM UD10K deployment.
-3.  **Network Integration (2 weeks):**  Integration with existing card reader infrastructure.
-4.  **User Training (1 week):**  Training for facility personnel on system operation and security protocols.
-5.  **Testing &amp; Validation (1 week):**  Thorough testing to ensure system functionality and security.
-6.  **Ongoing Support &amp; Maintenance (Ongoing):**  Regular maintenance and support to ensure optimal performance and security.
-We will provide detailed documentation and support throughout the implementation process.</w:t>
+        <w:t xml:space="preserve">Our implementation plan will involve:
+1.  **Assessment:**  Detailed assessment of existing access control infrastructure and facility layout.
+2.  **System Design:**  Customized system design based on facility requirements.
+3.  **Hardware Installation:**  Installation of COSEC ATOM RD100E readers, COSEC PATH DCFE controllers, and COSEC ARGO FACEE.
+4.  **Software Configuration:**  Configuration of access control software and integration with existing systems.
+5.  **Training:**  Training for facility personnel on system operation and maintenance.
+6.  **Testing &amp; Validation:**  Thorough testing and validation to ensure system functionality.
+7.  **Ongoing Support:**  Dedicated support and maintenance services.
+We will work closely with the client to ensure a smooth and successful implementation.
+**Timeline:**  Estimated implementation timeframe: 8-12 weeks.
+**Budget Breakdown:**  (Detailed breakdown will be provided upon request, including hardware, software, installation, training, and ongoing support.)</w:t>
       </w:r>
     </w:p>
     <w:p>
@@ -959,7 +964,7 @@
         <w:spacing w:after="240"/>
       </w:pPr>
       <w:r>
-        <w:t xml:space="preserve">The total investment for the proposed solution is $201,240.00. This investment represents a strategic investment in Matrix Comsec’s security and operational efficiency, providing a robust and scalable solution for years to come.  We believe this investment will significantly reduce risk, improve compliance, and contribute to the long-term success of the facility.  A detailed breakdown of costs is available upon request.</w:t>
+        <w:t xml:space="preserve">The proposed investment of $677,520.00 represents a strategic investment in a robust and scalable access control solution from Adani.  This investment will significantly reduce risk, streamline operations, and enhance data protection, ultimately contributing to improved operational efficiency and a secure manufacturing environment.  We are confident that this solution will deliver a strong return on investment through reduced security incidents, improved compliance, and enhanced productivity.  We are prepared to provide a detailed cost-benefit analysis and customized implementation plan to meet the specific needs of your facility.</w:t>
       </w:r>
     </w:p>
     <w:tbl>
@@ -1026,7 +1031,7 @@
               <w:jc w:val="right"/>
             </w:pPr>
             <w:r>
-              <w:t xml:space="preserve">$167,700.00</w:t>
+              <w:t xml:space="preserve">$564,600.00</w:t>
             </w:r>
           </w:p>
         </w:tc>
@@ -1081,7 +1086,7 @@
               <w:jc w:val="right"/>
             </w:pPr>
             <w:r>
-              <w:t xml:space="preserve">$33,540.00</w:t>
+              <w:t xml:space="preserve">$112,920.00</w:t>
             </w:r>
           </w:p>
         </w:tc>
@@ -1144,7 +1149,7 @@
                 <w:sz w:val="26"/>
                 <w:szCs w:val="26"/>
               </w:rPr>
-              <w:t xml:space="preserve">$201,240.00</w:t>
+              <w:t xml:space="preserve">$677,520.00</w:t>
             </w:r>
           </w:p>
         </w:tc>
@@ -1193,7 +1198,7 @@
               <w:jc w:val="right"/>
             </w:pPr>
             <w:r>
-              <w:t xml:space="preserve">$25,155.00/year</w:t>
+              <w:t xml:space="preserve">$84,690.00/year</w:t>
             </w:r>
           </w:p>
         </w:tc>

</xml_diff>